<commit_message>
Added mouse controls to doc. Added some database info to doc.
</commit_message>
<xml_diff>
--- a/docs/Group_3_UserGuide.docx
+++ b/docs/Group_3_UserGuide.docx
@@ -75,17 +75,23 @@
           <w:sz w:val="22"/>
           <w:szCs w:val="22"/>
         </w:rPr>
-        <w:t xml:space="preserve">Ethan </w:t>
-      </w:r>
-      <w:proofErr w:type="spellStart"/>
+        <w:t>Ethan Wasniak</w:t>
+      </w:r>
+    </w:p>
+    <w:p>
+      <w:pPr>
+        <w:numPr>
+          <w:ilvl w:val="0"/>
+          <w:numId w:val="2"/>
+        </w:numPr>
+      </w:pPr>
       <w:r>
         <w:rPr>
           <w:sz w:val="22"/>
           <w:szCs w:val="22"/>
         </w:rPr>
-        <w:t>Wasniak</w:t>
-      </w:r>
-      <w:proofErr w:type="spellEnd"/>
+        <w:t>Brendan Laird</w:t>
+      </w:r>
     </w:p>
     <w:p>
       <w:pPr>
@@ -99,7 +105,7 @@
           <w:sz w:val="22"/>
           <w:szCs w:val="22"/>
         </w:rPr>
-        <w:t>Brendan Laird</w:t>
+        <w:t>Steven Dickinson</w:t>
       </w:r>
     </w:p>
     <w:p>
@@ -114,7 +120,7 @@
           <w:sz w:val="22"/>
           <w:szCs w:val="22"/>
         </w:rPr>
-        <w:t>Steven Dickinson</w:t>
+        <w:t xml:space="preserve">Kenise Balton, </w:t>
       </w:r>
     </w:p>
     <w:p>
@@ -129,69 +135,60 @@
           <w:sz w:val="22"/>
           <w:szCs w:val="22"/>
         </w:rPr>
-        <w:t xml:space="preserve">Kenise Balton, </w:t>
-      </w:r>
-    </w:p>
-    <w:p>
-      <w:pPr>
-        <w:numPr>
-          <w:ilvl w:val="0"/>
-          <w:numId w:val="2"/>
-        </w:numPr>
-      </w:pPr>
-      <w:r>
+        <w:t>Francini Clemmons</w:t>
+      </w:r>
+    </w:p>
+    <w:p>
+      <w:pPr>
+        <w:spacing w:after="80"/>
         <w:rPr>
           <w:sz w:val="22"/>
           <w:szCs w:val="22"/>
         </w:rPr>
-        <w:t>Francini Clemmons</w:t>
-      </w:r>
-    </w:p>
-    <w:p>
-      <w:pPr>
-        <w:spacing w:after="80"/>
+      </w:pPr>
+      <w:r>
         <w:rPr>
           <w:sz w:val="22"/>
           <w:szCs w:val="22"/>
         </w:rPr>
-      </w:pPr>
+        <w:t>Course Deliverable:</w:t>
+      </w:r>
       <w:r>
         <w:rPr>
           <w:sz w:val="22"/>
           <w:szCs w:val="22"/>
         </w:rPr>
-        <w:t>Course Deliverable:</w:t>
-      </w:r>
-      <w:r>
+        <w:tab/>
+        <w:t>User Guide</w:t>
+      </w:r>
+    </w:p>
+    <w:p>
+      <w:pPr>
+        <w:spacing w:after="80"/>
         <w:rPr>
           <w:sz w:val="22"/>
           <w:szCs w:val="22"/>
         </w:rPr>
-        <w:tab/>
-        <w:t>User Guide</w:t>
-      </w:r>
-    </w:p>
-    <w:p>
-      <w:pPr>
-        <w:spacing w:after="80"/>
+      </w:pPr>
+      <w:r>
         <w:rPr>
           <w:sz w:val="22"/>
           <w:szCs w:val="22"/>
         </w:rPr>
-      </w:pPr>
+        <w:t xml:space="preserve">Project Context: </w:t>
+      </w:r>
       <w:r>
         <w:rPr>
           <w:sz w:val="22"/>
           <w:szCs w:val="22"/>
         </w:rPr>
-        <w:t xml:space="preserve">Project Context: </w:t>
+        <w:tab/>
       </w:r>
       <w:r>
         <w:rPr>
           <w:sz w:val="22"/>
           <w:szCs w:val="22"/>
         </w:rPr>
-        <w:tab/>
         <w:t>Built from the approved Project Plan and Theory/Design documents</w:t>
       </w:r>
       <w:r>
@@ -465,25 +462,7 @@
                 <w:sz w:val="22"/>
                 <w:szCs w:val="22"/>
               </w:rPr>
-              <w:t xml:space="preserve"> preset workflow (`CMakeLists.txt`, `</w:t>
-            </w:r>
-            <w:proofErr w:type="spellStart"/>
-            <w:r>
-              <w:rPr>
-                <w:rFonts w:ascii="Aptos" w:eastAsia="Aptos" w:hAnsi="Aptos" w:cs="Aptos"/>
-                <w:sz w:val="22"/>
-                <w:szCs w:val="22"/>
-              </w:rPr>
-              <w:t>CMakePresets.json</w:t>
-            </w:r>
-            <w:proofErr w:type="spellEnd"/>
-            <w:r>
-              <w:rPr>
-                <w:rFonts w:ascii="Aptos" w:eastAsia="Aptos" w:hAnsi="Aptos" w:cs="Aptos"/>
-                <w:sz w:val="22"/>
-                <w:szCs w:val="22"/>
-              </w:rPr>
-              <w:t xml:space="preserve">`). The repository documents both local script-based builds and </w:t>
+              <w:t xml:space="preserve"> preset workflow (`CMakeLists.txt`, `CMakePresets.json`). The repository documents both local script-based builds and </w:t>
             </w:r>
             <w:proofErr w:type="spellStart"/>
             <w:r>
@@ -885,14 +864,26 @@
           <w:numId w:val="1"/>
         </w:numPr>
         <w:spacing w:before="0" w:after="0"/>
-      </w:pPr>
-      <w:r>
+        <w:rPr>
+          <w:lang w:val="fr-FR"/>
+        </w:rPr>
+      </w:pPr>
+      <w:r>
+        <w:rPr>
+          <w:lang w:val="fr-FR"/>
+        </w:rPr>
         <w:t>C++</w:t>
       </w:r>
       <w:r>
+        <w:rPr>
+          <w:lang w:val="fr-FR"/>
+        </w:rPr>
         <w:t>20</w:t>
       </w:r>
       <w:r>
+        <w:rPr>
+          <w:lang w:val="fr-FR"/>
+        </w:rPr>
         <w:t xml:space="preserve"> compiler (GCC or Clang)</w:t>
       </w:r>
     </w:p>
@@ -1064,18 +1055,8 @@
                 <w:shd w:val="clear" w:color="auto" w:fill="333333"/>
               </w:rPr>
               <w:br/>
-              <w:t xml:space="preserve">cd </w:t>
-            </w:r>
-            <w:proofErr w:type="spellStart"/>
-            <w:r>
-              <w:rPr>
-                <w:rFonts w:ascii="Consolas" w:eastAsia="Consolas" w:hAnsi="Consolas" w:cs="Consolas"/>
-                <w:color w:val="FFFFFF"/>
-                <w:shd w:val="clear" w:color="auto" w:fill="333333"/>
-              </w:rPr>
-              <w:t>BreakoutGame</w:t>
-            </w:r>
-            <w:proofErr w:type="spellEnd"/>
+              <w:t>cd BreakoutGame</w:t>
+            </w:r>
           </w:p>
         </w:tc>
       </w:tr>
@@ -1672,7 +1653,6 @@
               </w:rPr>
               <w:t>/build/</w:t>
             </w:r>
-            <w:proofErr w:type="spellStart"/>
             <w:r>
               <w:rPr>
                 <w:rFonts w:ascii="Consolas" w:eastAsia="Consolas" w:hAnsi="Consolas" w:cs="Consolas"/>
@@ -1681,7 +1661,6 @@
               </w:rPr>
               <w:t>BreakoutGame</w:t>
             </w:r>
-            <w:proofErr w:type="spellEnd"/>
           </w:p>
         </w:tc>
       </w:tr>
@@ -2164,6 +2143,9 @@
     <w:p>
       <w:pPr>
         <w:pStyle w:val="Heading2"/>
+        <w:rPr>
+          <w:color w:val="3C78D8"/>
+        </w:rPr>
       </w:pPr>
       <w:bookmarkStart w:id="11" w:name="_ghih5sfrcv7x" w:colFirst="0" w:colLast="0"/>
       <w:bookmarkEnd w:id="11"/>
@@ -2177,6 +2159,19 @@
     <w:p>
       <w:pPr>
         <w:pStyle w:val="Heading3"/>
+        <w:ind w:left="0"/>
+      </w:pPr>
+      <w:r>
+        <w:t xml:space="preserve">  </w:t>
+      </w:r>
+      <w:r>
+        <w:t xml:space="preserve">6.1 Keyboard: </w:t>
+      </w:r>
+    </w:p>
+    <w:p>
+      <w:pPr>
+        <w:pStyle w:val="Heading4"/>
+        <w:ind w:firstLine="360"/>
       </w:pPr>
       <w:bookmarkStart w:id="12" w:name="_k1qlqfwhjprm" w:colFirst="0" w:colLast="0"/>
       <w:bookmarkEnd w:id="12"/>
@@ -2234,7 +2229,8 @@
     </w:p>
     <w:p>
       <w:pPr>
-        <w:pStyle w:val="Heading3"/>
+        <w:pStyle w:val="Heading4"/>
+        <w:ind w:firstLine="360"/>
       </w:pPr>
       <w:bookmarkStart w:id="13" w:name="_x3mdcwl32iri" w:colFirst="0" w:colLast="0"/>
       <w:bookmarkEnd w:id="13"/>
@@ -2341,7 +2337,8 @@
     </w:p>
     <w:p>
       <w:pPr>
-        <w:pStyle w:val="Heading3"/>
+        <w:pStyle w:val="Heading4"/>
+        <w:ind w:firstLine="360"/>
       </w:pPr>
       <w:bookmarkStart w:id="14" w:name="_nwvtdnmo1cwp" w:colFirst="0" w:colLast="0"/>
       <w:bookmarkEnd w:id="14"/>
@@ -2428,11 +2425,13 @@
     </w:p>
     <w:p>
       <w:pPr>
-        <w:pStyle w:val="Heading3"/>
+        <w:pStyle w:val="Heading4"/>
+        <w:ind w:firstLine="360"/>
       </w:pPr>
       <w:bookmarkStart w:id="15" w:name="_fdeflpr5k61t" w:colFirst="0" w:colLast="0"/>
       <w:bookmarkEnd w:id="15"/>
       <w:r>
+        <w:lastRenderedPageBreak/>
         <w:t>After win or game over</w:t>
       </w:r>
     </w:p>
@@ -2496,6 +2495,186 @@
     </w:p>
     <w:p>
       <w:pPr>
+        <w:pStyle w:val="Heading3"/>
+        <w:ind w:left="0"/>
+      </w:pPr>
+      <w:r>
+        <w:t xml:space="preserve">  </w:t>
+      </w:r>
+      <w:r>
+        <w:t xml:space="preserve">6.1 </w:t>
+      </w:r>
+      <w:r>
+        <w:t>Mouse</w:t>
+      </w:r>
+      <w:r>
+        <w:t>:</w:t>
+      </w:r>
+    </w:p>
+    <w:p>
+      <w:pPr>
+        <w:pStyle w:val="Heading4"/>
+        <w:ind w:firstLine="360"/>
+      </w:pPr>
+      <w:r>
+        <w:t>Main menu</w:t>
+      </w:r>
+    </w:p>
+    <w:p>
+      <w:pPr>
+        <w:numPr>
+          <w:ilvl w:val="0"/>
+          <w:numId w:val="1"/>
+        </w:numPr>
+        <w:spacing w:after="0"/>
+      </w:pPr>
+      <w:r>
+        <w:t>Can click on</w:t>
+      </w:r>
+      <w:r>
+        <w:t>:</w:t>
+      </w:r>
+      <w:r>
+        <w:t xml:space="preserve"> </w:t>
+      </w:r>
+      <w:r>
+        <w:t>‘</w:t>
+      </w:r>
+      <w:r>
+        <w:rPr>
+          <w:rFonts w:ascii="Roboto Mono" w:eastAsia="Roboto Mono" w:hAnsi="Roboto Mono" w:cs="Roboto Mono"/>
+          <w:color w:val="188038"/>
+        </w:rPr>
+        <w:t>Play</w:t>
+      </w:r>
+      <w:r>
+        <w:rPr>
+          <w:rFonts w:ascii="Roboto Mono" w:eastAsia="Roboto Mono" w:hAnsi="Roboto Mono" w:cs="Roboto Mono"/>
+          <w:color w:val="188038"/>
+        </w:rPr>
+        <w:t>’</w:t>
+      </w:r>
+      <w:r>
+        <w:rPr>
+          <w:rFonts w:ascii="Roboto Mono" w:eastAsia="Roboto Mono" w:hAnsi="Roboto Mono" w:cs="Roboto Mono"/>
+        </w:rPr>
+        <w:t xml:space="preserve">, </w:t>
+      </w:r>
+      <w:r>
+        <w:rPr>
+          <w:rFonts w:ascii="Roboto Mono" w:eastAsia="Roboto Mono" w:hAnsi="Roboto Mono" w:cs="Roboto Mono"/>
+        </w:rPr>
+        <w:t>‘</w:t>
+      </w:r>
+      <w:r>
+        <w:rPr>
+          <w:rFonts w:ascii="Roboto Mono" w:eastAsia="Roboto Mono" w:hAnsi="Roboto Mono" w:cs="Roboto Mono"/>
+          <w:color w:val="188038"/>
+        </w:rPr>
+        <w:t>Settings</w:t>
+      </w:r>
+      <w:r>
+        <w:rPr>
+          <w:rFonts w:ascii="Roboto Mono" w:eastAsia="Roboto Mono" w:hAnsi="Roboto Mono" w:cs="Roboto Mono"/>
+          <w:color w:val="188038"/>
+        </w:rPr>
+        <w:t>’</w:t>
+      </w:r>
+      <w:r>
+        <w:rPr>
+          <w:rFonts w:ascii="Roboto Mono" w:eastAsia="Roboto Mono" w:hAnsi="Roboto Mono" w:cs="Roboto Mono"/>
+        </w:rPr>
+        <w:t>,</w:t>
+      </w:r>
+      <w:r>
+        <w:t xml:space="preserve"> and</w:t>
+      </w:r>
+      <w:r>
+        <w:rPr>
+          <w:rFonts w:ascii="Roboto Mono" w:eastAsia="Roboto Mono" w:hAnsi="Roboto Mono" w:cs="Roboto Mono"/>
+        </w:rPr>
+        <w:t xml:space="preserve"> </w:t>
+      </w:r>
+      <w:r>
+        <w:rPr>
+          <w:rFonts w:ascii="Roboto Mono" w:eastAsia="Roboto Mono" w:hAnsi="Roboto Mono" w:cs="Roboto Mono"/>
+        </w:rPr>
+        <w:t>‘</w:t>
+      </w:r>
+      <w:r>
+        <w:rPr>
+          <w:rFonts w:ascii="Roboto Mono" w:eastAsia="Roboto Mono" w:hAnsi="Roboto Mono" w:cs="Roboto Mono"/>
+          <w:color w:val="188038"/>
+        </w:rPr>
+        <w:t>Up</w:t>
+      </w:r>
+      <w:r>
+        <w:rPr>
+          <w:rFonts w:ascii="Roboto Mono" w:eastAsia="Roboto Mono" w:hAnsi="Roboto Mono" w:cs="Roboto Mono"/>
+          <w:color w:val="188038"/>
+        </w:rPr>
+        <w:t>’</w:t>
+      </w:r>
+      <w:r>
+        <w:rPr>
+          <w:rFonts w:ascii="Roboto Mono" w:eastAsia="Roboto Mono" w:hAnsi="Roboto Mono" w:cs="Roboto Mono"/>
+          <w:color w:val="188038"/>
+        </w:rPr>
+        <w:t xml:space="preserve"> </w:t>
+      </w:r>
+    </w:p>
+    <w:p>
+      <w:pPr>
+        <w:pStyle w:val="Heading4"/>
+        <w:ind w:firstLine="360"/>
+      </w:pPr>
+      <w:r>
+        <w:t>Settings screen</w:t>
+      </w:r>
+    </w:p>
+    <w:p>
+      <w:pPr>
+        <w:numPr>
+          <w:ilvl w:val="0"/>
+          <w:numId w:val="1"/>
+        </w:numPr>
+        <w:spacing w:after="0"/>
+      </w:pPr>
+      <w:r>
+        <w:t xml:space="preserve">Can click on: </w:t>
+      </w:r>
+      <w:r>
+        <w:t>‘</w:t>
+      </w:r>
+      <w:r>
+        <w:rPr>
+          <w:rFonts w:ascii="Roboto Mono" w:eastAsia="Roboto Mono" w:hAnsi="Roboto Mono" w:cs="Roboto Mono"/>
+          <w:color w:val="188038"/>
+        </w:rPr>
+        <w:t xml:space="preserve">Back to </w:t>
+      </w:r>
+      <w:r>
+        <w:rPr>
+          <w:rFonts w:ascii="Roboto Mono" w:eastAsia="Roboto Mono" w:hAnsi="Roboto Mono" w:cs="Roboto Mono"/>
+          <w:color w:val="188038"/>
+        </w:rPr>
+        <w:t>m</w:t>
+      </w:r>
+      <w:r>
+        <w:rPr>
+          <w:rFonts w:ascii="Roboto Mono" w:eastAsia="Roboto Mono" w:hAnsi="Roboto Mono" w:cs="Roboto Mono"/>
+          <w:color w:val="188038"/>
+        </w:rPr>
+        <w:t>enu’</w:t>
+      </w:r>
+    </w:p>
+    <w:p>
+      <w:pPr>
+        <w:spacing w:before="0"/>
+      </w:pPr>
+    </w:p>
+    <w:p>
+      <w:pPr>
         <w:pStyle w:val="Heading2"/>
       </w:pPr>
       <w:bookmarkStart w:id="16" w:name="_gbw5l82o6t0x" w:colFirst="0" w:colLast="0"/>
@@ -2504,7 +2683,6 @@
         <w:rPr>
           <w:color w:val="3C78D8"/>
         </w:rPr>
-        <w:lastRenderedPageBreak/>
         <w:t>7. Gameplay Overview</w:t>
       </w:r>
     </w:p>
@@ -2680,6 +2858,7 @@
         <w:rPr>
           <w:color w:val="3C78D8"/>
         </w:rPr>
+        <w:lastRenderedPageBreak/>
         <w:t>8. Game Features</w:t>
       </w:r>
     </w:p>
@@ -2709,7 +2888,7 @@
         <w:spacing w:before="0" w:after="0"/>
       </w:pPr>
       <w:r>
-        <w:t>Settings screen with adjustable gameplay parameters (such as paddle speed and ball speed)</w:t>
+        <w:t>High score from database is displayed on main menu if above 0</w:t>
       </w:r>
     </w:p>
     <w:p>
@@ -2721,6 +2900,18 @@
         <w:spacing w:before="0" w:after="0"/>
       </w:pPr>
       <w:r>
+        <w:t xml:space="preserve">Settings screen with adjustable gameplay parameters (such as paddle speed and ball speed) </w:t>
+      </w:r>
+    </w:p>
+    <w:p>
+      <w:pPr>
+        <w:numPr>
+          <w:ilvl w:val="0"/>
+          <w:numId w:val="1"/>
+        </w:numPr>
+        <w:spacing w:before="0" w:after="0"/>
+      </w:pPr>
+      <w:r>
         <w:t>Keyboard-based paddle control (Arrow keys or WASD)</w:t>
       </w:r>
     </w:p>
@@ -2782,6 +2973,18 @@
       </w:pPr>
       <w:r>
         <w:t>Win condition when all bricks are cleared</w:t>
+      </w:r>
+    </w:p>
+    <w:p>
+      <w:pPr>
+        <w:numPr>
+          <w:ilvl w:val="0"/>
+          <w:numId w:val="1"/>
+        </w:numPr>
+        <w:spacing w:before="0" w:after="0"/>
+      </w:pPr>
+      <w:r>
+        <w:t>One win, if new score is higher than previous stored score, will update in database</w:t>
       </w:r>
     </w:p>
     <w:p>
@@ -2944,6 +3147,7 @@
         <w:rPr>
           <w:color w:val="3C78D8"/>
         </w:rPr>
+        <w:lastRenderedPageBreak/>
         <w:t>10. Known Limitations</w:t>
       </w:r>
     </w:p>
@@ -4004,6 +4208,7 @@
   <w:style w:type="paragraph" w:default="1" w:styleId="Normal">
     <w:name w:val="Normal"/>
     <w:qFormat/>
+    <w:rsid w:val="00B64490"/>
   </w:style>
   <w:style w:type="paragraph" w:styleId="Heading1">
     <w:name w:val="heading 1"/>
@@ -4051,6 +4256,7 @@
     <w:name w:val="heading 3"/>
     <w:basedOn w:val="Normal"/>
     <w:next w:val="Normal"/>
+    <w:link w:val="Heading3Char"/>
     <w:uiPriority w:val="9"/>
     <w:unhideWhenUsed/>
     <w:qFormat/>
@@ -4072,8 +4278,8 @@
     <w:name w:val="heading 4"/>
     <w:basedOn w:val="Normal"/>
     <w:next w:val="Normal"/>
+    <w:link w:val="Heading4Char"/>
     <w:uiPriority w:val="9"/>
-    <w:semiHidden/>
     <w:unhideWhenUsed/>
     <w:qFormat/>
     <w:pPr>
@@ -4279,6 +4485,30 @@
       <w:ind w:left="720"/>
       <w:contextualSpacing/>
     </w:pPr>
+  </w:style>
+  <w:style w:type="character" w:customStyle="1" w:styleId="Heading3Char">
+    <w:name w:val="Heading 3 Char"/>
+    <w:basedOn w:val="DefaultParagraphFont"/>
+    <w:link w:val="Heading3"/>
+    <w:uiPriority w:val="9"/>
+    <w:rsid w:val="00EA7806"/>
+    <w:rPr>
+      <w:rFonts w:ascii="Calibri" w:eastAsia="Calibri" w:hAnsi="Calibri" w:cs="Calibri"/>
+      <w:b/>
+      <w:bCs/>
+      <w:color w:val="2F5597"/>
+    </w:rPr>
+  </w:style>
+  <w:style w:type="character" w:customStyle="1" w:styleId="Heading4Char">
+    <w:name w:val="Heading 4 Char"/>
+    <w:basedOn w:val="DefaultParagraphFont"/>
+    <w:link w:val="Heading4"/>
+    <w:uiPriority w:val="9"/>
+    <w:rsid w:val="00EA7806"/>
+    <w:rPr>
+      <w:rFonts w:ascii="Calibri" w:eastAsia="Calibri" w:hAnsi="Calibri" w:cs="Calibri"/>
+      <w:color w:val="2F5597"/>
+    </w:rPr>
   </w:style>
 </w:styles>
 </file>

</xml_diff>

<commit_message>
Added audio for bouncing and updated docs to reflect.
</commit_message>
<xml_diff>
--- a/docs/Group_3_UserGuide.docx
+++ b/docs/Group_3_UserGuide.docx
@@ -89,18 +89,27 @@
           <w:sz w:val="22"/>
           <w:szCs w:val="22"/>
         </w:rPr>
-        <w:t xml:space="preserve">Ethan </w:t>
-      </w:r>
-      <w:proofErr w:type="spellStart"/>
+        <w:t>Ethan Wasniak</w:t>
+      </w:r>
+    </w:p>
+    <w:p>
+      <w:pPr>
+        <w:numPr>
+          <w:ilvl w:val="0"/>
+          <w:numId w:val="2"/>
+        </w:numPr>
+        <w:rPr>
+          <w:rFonts w:asciiTheme="majorHAnsi" w:hAnsiTheme="majorHAnsi" w:cstheme="majorHAnsi"/>
+        </w:rPr>
+      </w:pPr>
       <w:r>
         <w:rPr>
           <w:rFonts w:asciiTheme="majorHAnsi" w:hAnsiTheme="majorHAnsi" w:cstheme="majorHAnsi"/>
           <w:sz w:val="22"/>
           <w:szCs w:val="22"/>
         </w:rPr>
-        <w:t>Wasniak</w:t>
-      </w:r>
-      <w:proofErr w:type="spellEnd"/>
+        <w:t>Brendan Laird</w:t>
+      </w:r>
     </w:p>
     <w:p>
       <w:pPr>
@@ -118,7 +127,7 @@
           <w:sz w:val="22"/>
           <w:szCs w:val="22"/>
         </w:rPr>
-        <w:t>Brendan Laird</w:t>
+        <w:t>Steven Dickinson</w:t>
       </w:r>
     </w:p>
     <w:p>
@@ -137,7 +146,7 @@
           <w:sz w:val="22"/>
           <w:szCs w:val="22"/>
         </w:rPr>
-        <w:t>Steven Dickinson</w:t>
+        <w:t xml:space="preserve">Kenise Balton, </w:t>
       </w:r>
     </w:p>
     <w:p>
@@ -156,54 +165,25 @@
           <w:sz w:val="22"/>
           <w:szCs w:val="22"/>
         </w:rPr>
-        <w:t xml:space="preserve">Kenise Balton, </w:t>
-      </w:r>
-    </w:p>
-    <w:p>
-      <w:pPr>
-        <w:numPr>
-          <w:ilvl w:val="0"/>
-          <w:numId w:val="2"/>
-        </w:numPr>
-        <w:rPr>
-          <w:rFonts w:asciiTheme="majorHAnsi" w:hAnsiTheme="majorHAnsi" w:cstheme="majorHAnsi"/>
-        </w:rPr>
-      </w:pPr>
-      <w:r>
+        <w:t>Francini Clemmons</w:t>
+      </w:r>
+    </w:p>
+    <w:p>
+      <w:pPr>
+        <w:spacing w:after="80"/>
         <w:rPr>
           <w:rFonts w:asciiTheme="majorHAnsi" w:hAnsiTheme="majorHAnsi" w:cstheme="majorHAnsi"/>
           <w:sz w:val="22"/>
           <w:szCs w:val="22"/>
         </w:rPr>
-        <w:t>Francini Clemmons</w:t>
-      </w:r>
-    </w:p>
-    <w:p>
-      <w:pPr>
-        <w:spacing w:after="80"/>
+      </w:pPr>
+      <w:r>
         <w:rPr>
           <w:rFonts w:asciiTheme="majorHAnsi" w:hAnsiTheme="majorHAnsi" w:cstheme="majorHAnsi"/>
           <w:sz w:val="22"/>
           <w:szCs w:val="22"/>
         </w:rPr>
-      </w:pPr>
-      <w:proofErr w:type="gramStart"/>
-      <w:r>
-        <w:rPr>
-          <w:rFonts w:asciiTheme="majorHAnsi" w:hAnsiTheme="majorHAnsi" w:cstheme="majorHAnsi"/>
-          <w:sz w:val="22"/>
-          <w:szCs w:val="22"/>
-        </w:rPr>
-        <w:t>Course Deliverable</w:t>
-      </w:r>
-      <w:proofErr w:type="gramEnd"/>
-      <w:r>
-        <w:rPr>
-          <w:rFonts w:asciiTheme="majorHAnsi" w:hAnsiTheme="majorHAnsi" w:cstheme="majorHAnsi"/>
-          <w:sz w:val="22"/>
-          <w:szCs w:val="22"/>
-        </w:rPr>
-        <w:t>:</w:t>
+        <w:t>Course Deliverable:</w:t>
       </w:r>
       <w:r>
         <w:rPr>
@@ -502,79 +482,7 @@
                 <w:sz w:val="22"/>
                 <w:szCs w:val="22"/>
               </w:rPr>
-              <w:t xml:space="preserve">C++20 with SFML 3.0.2. The final build can be launched from the repository root through the shared PowerShell toolchain resolver (`scripts/Resolve-Toolchain.ps1`) or through the </w:t>
-            </w:r>
-            <w:proofErr w:type="spellStart"/>
-            <w:r>
-              <w:rPr>
-                <w:rFonts w:asciiTheme="majorHAnsi" w:eastAsia="Aptos" w:hAnsiTheme="majorHAnsi" w:cstheme="majorHAnsi"/>
-                <w:sz w:val="22"/>
-                <w:szCs w:val="22"/>
-              </w:rPr>
-              <w:t>CMake</w:t>
-            </w:r>
-            <w:proofErr w:type="spellEnd"/>
-            <w:r>
-              <w:rPr>
-                <w:rFonts w:asciiTheme="majorHAnsi" w:eastAsia="Aptos" w:hAnsiTheme="majorHAnsi" w:cstheme="majorHAnsi"/>
-                <w:sz w:val="22"/>
-                <w:szCs w:val="22"/>
-              </w:rPr>
-              <w:t xml:space="preserve"> preset workflow (`CMakeLists.txt`, `</w:t>
-            </w:r>
-            <w:proofErr w:type="spellStart"/>
-            <w:r>
-              <w:rPr>
-                <w:rFonts w:asciiTheme="majorHAnsi" w:eastAsia="Aptos" w:hAnsiTheme="majorHAnsi" w:cstheme="majorHAnsi"/>
-                <w:sz w:val="22"/>
-                <w:szCs w:val="22"/>
-              </w:rPr>
-              <w:t>CMakePresets.json</w:t>
-            </w:r>
-            <w:proofErr w:type="spellEnd"/>
-            <w:r>
-              <w:rPr>
-                <w:rFonts w:asciiTheme="majorHAnsi" w:eastAsia="Aptos" w:hAnsiTheme="majorHAnsi" w:cstheme="majorHAnsi"/>
-                <w:sz w:val="22"/>
-                <w:szCs w:val="22"/>
-              </w:rPr>
-              <w:t xml:space="preserve">`). The repository documents both local script-based builds and </w:t>
-            </w:r>
-            <w:proofErr w:type="spellStart"/>
-            <w:r>
-              <w:rPr>
-                <w:rFonts w:asciiTheme="majorHAnsi" w:eastAsia="Aptos" w:hAnsiTheme="majorHAnsi" w:cstheme="majorHAnsi"/>
-                <w:sz w:val="22"/>
-                <w:szCs w:val="22"/>
-              </w:rPr>
-              <w:t>CMake</w:t>
-            </w:r>
-            <w:proofErr w:type="spellEnd"/>
-            <w:r>
-              <w:rPr>
-                <w:rFonts w:asciiTheme="majorHAnsi" w:eastAsia="Aptos" w:hAnsiTheme="majorHAnsi" w:cstheme="majorHAnsi"/>
-                <w:sz w:val="22"/>
-                <w:szCs w:val="22"/>
-              </w:rPr>
-              <w:t>/</w:t>
-            </w:r>
-            <w:proofErr w:type="spellStart"/>
-            <w:r>
-              <w:rPr>
-                <w:rFonts w:asciiTheme="majorHAnsi" w:eastAsia="Aptos" w:hAnsiTheme="majorHAnsi" w:cstheme="majorHAnsi"/>
-                <w:sz w:val="22"/>
-                <w:szCs w:val="22"/>
-              </w:rPr>
-              <w:t>CTest</w:t>
-            </w:r>
-            <w:proofErr w:type="spellEnd"/>
-            <w:r>
-              <w:rPr>
-                <w:rFonts w:asciiTheme="majorHAnsi" w:eastAsia="Aptos" w:hAnsiTheme="majorHAnsi" w:cstheme="majorHAnsi"/>
-                <w:sz w:val="22"/>
-                <w:szCs w:val="22"/>
-              </w:rPr>
-              <w:t>-based validation for Windows GCC + SFML environments.</w:t>
+              <w:t>C++20 with SFML 3.0.2. The final build can be launched from the repository root through the shared PowerShell toolchain resolver (`scripts/Resolve-Toolchain.ps1`) or through the CMake preset workflow (`CMakeLists.txt`, `CMakePresets.json`). The repository documents both local script-based builds and CMake/CTest-based validation for Windows GCC + SFML environments.</w:t>
             </w:r>
           </w:p>
           <w:p>
@@ -592,25 +500,7 @@
                 <w:sz w:val="22"/>
                 <w:szCs w:val="22"/>
               </w:rPr>
-              <w:t xml:space="preserve">Both script-based and </w:t>
-            </w:r>
-            <w:proofErr w:type="spellStart"/>
-            <w:r>
-              <w:rPr>
-                <w:rFonts w:asciiTheme="majorHAnsi" w:eastAsia="Aptos" w:hAnsiTheme="majorHAnsi" w:cstheme="majorHAnsi"/>
-                <w:sz w:val="22"/>
-                <w:szCs w:val="22"/>
-              </w:rPr>
-              <w:t>CMake</w:t>
-            </w:r>
-            <w:proofErr w:type="spellEnd"/>
-            <w:r>
-              <w:rPr>
-                <w:rFonts w:asciiTheme="majorHAnsi" w:eastAsia="Aptos" w:hAnsiTheme="majorHAnsi" w:cstheme="majorHAnsi"/>
-                <w:sz w:val="22"/>
-                <w:szCs w:val="22"/>
-              </w:rPr>
-              <w:t>-based workflows were validated to ensure consistent build behavior across supported development environments.</w:t>
+              <w:t>Both script-based and CMake-based workflows were validated to ensure consistent build behavior across supported development environments.</w:t>
             </w:r>
           </w:p>
         </w:tc>
@@ -658,21 +548,7 @@
         <w:rPr>
           <w:rFonts w:asciiTheme="majorHAnsi" w:hAnsiTheme="majorHAnsi" w:cstheme="majorHAnsi"/>
         </w:rPr>
-        <w:t xml:space="preserve">Players lose </w:t>
-      </w:r>
-      <w:proofErr w:type="gramStart"/>
-      <w:r>
-        <w:rPr>
-          <w:rFonts w:asciiTheme="majorHAnsi" w:hAnsiTheme="majorHAnsi" w:cstheme="majorHAnsi"/>
-        </w:rPr>
-        <w:t>a life</w:t>
-      </w:r>
-      <w:proofErr w:type="gramEnd"/>
-      <w:r>
-        <w:rPr>
-          <w:rFonts w:asciiTheme="majorHAnsi" w:hAnsiTheme="majorHAnsi" w:cstheme="majorHAnsi"/>
-        </w:rPr>
-        <w:t xml:space="preserve"> each time the ball falls below the paddle. The game ends when either all bricks are cleared (win condition) or all lives are lost (game over).</w:t>
+        <w:t>Players lose a life each time the ball falls below the paddle. The game ends when either all bricks are cleared (win condition) or all lives are lost (game over).</w:t>
       </w:r>
     </w:p>
     <w:p>
@@ -779,19 +655,11 @@
           <w:rFonts w:asciiTheme="majorHAnsi" w:hAnsiTheme="majorHAnsi" w:cstheme="majorHAnsi"/>
         </w:rPr>
       </w:pPr>
-      <w:proofErr w:type="spellStart"/>
-      <w:r>
-        <w:rPr>
-          <w:rFonts w:asciiTheme="majorHAnsi" w:hAnsiTheme="majorHAnsi" w:cstheme="majorHAnsi"/>
-        </w:rPr>
-        <w:t>CMake</w:t>
-      </w:r>
-      <w:proofErr w:type="spellEnd"/>
-      <w:r>
-        <w:rPr>
-          <w:rFonts w:asciiTheme="majorHAnsi" w:hAnsiTheme="majorHAnsi" w:cstheme="majorHAnsi"/>
-        </w:rPr>
-        <w:t xml:space="preserve"> 3.2</w:t>
+      <w:r>
+        <w:rPr>
+          <w:rFonts w:asciiTheme="majorHAnsi" w:hAnsiTheme="majorHAnsi" w:cstheme="majorHAnsi"/>
+        </w:rPr>
+        <w:t>CMake 3.2</w:t>
       </w:r>
       <w:r>
         <w:rPr>
@@ -996,21 +864,7 @@
         <w:rPr>
           <w:rFonts w:asciiTheme="majorHAnsi" w:hAnsiTheme="majorHAnsi" w:cstheme="majorHAnsi"/>
         </w:rPr>
-        <w:t xml:space="preserve">The projects current </w:t>
-      </w:r>
-      <w:proofErr w:type="spellStart"/>
-      <w:r>
-        <w:rPr>
-          <w:rFonts w:asciiTheme="majorHAnsi" w:hAnsiTheme="majorHAnsi" w:cstheme="majorHAnsi"/>
-        </w:rPr>
-        <w:t>CMake</w:t>
-      </w:r>
-      <w:proofErr w:type="spellEnd"/>
-      <w:r>
-        <w:rPr>
-          <w:rFonts w:asciiTheme="majorHAnsi" w:hAnsiTheme="majorHAnsi" w:cstheme="majorHAnsi"/>
-        </w:rPr>
-        <w:t xml:space="preserve"> configuration uses C++20.</w:t>
+        <w:t>The projects current CMake configuration uses C++20.</w:t>
       </w:r>
     </w:p>
     <w:p>
@@ -1029,21 +883,7 @@
         <w:rPr>
           <w:rFonts w:asciiTheme="majorHAnsi" w:hAnsiTheme="majorHAnsi" w:cstheme="majorHAnsi"/>
         </w:rPr>
-        <w:t xml:space="preserve">On Windows, the easiest workflow is to build from the repository root and launch the game with the included PowerShell </w:t>
-      </w:r>
-      <w:proofErr w:type="gramStart"/>
-      <w:r>
-        <w:rPr>
-          <w:rFonts w:asciiTheme="majorHAnsi" w:hAnsiTheme="majorHAnsi" w:cstheme="majorHAnsi"/>
-        </w:rPr>
-        <w:t>script</w:t>
-      </w:r>
-      <w:proofErr w:type="gramEnd"/>
-      <w:r>
-        <w:rPr>
-          <w:rFonts w:asciiTheme="majorHAnsi" w:hAnsiTheme="majorHAnsi" w:cstheme="majorHAnsi"/>
-        </w:rPr>
-        <w:t xml:space="preserve"> so the required runtime libraries are available.</w:t>
+        <w:t>On Windows, the easiest workflow is to build from the repository root and launch the game with the included PowerShell script so the required runtime libraries are available.</w:t>
       </w:r>
     </w:p>
     <w:p>
@@ -1159,7 +999,6 @@
           <w:rFonts w:asciiTheme="majorHAnsi" w:hAnsiTheme="majorHAnsi" w:cstheme="majorHAnsi"/>
         </w:rPr>
       </w:pPr>
-      <w:proofErr w:type="spellStart"/>
       <w:r>
         <w:rPr>
           <w:rFonts w:asciiTheme="majorHAnsi" w:hAnsiTheme="majorHAnsi" w:cstheme="majorHAnsi"/>
@@ -1167,7 +1006,6 @@
         <w:lastRenderedPageBreak/>
         <w:t>CMake</w:t>
       </w:r>
-      <w:proofErr w:type="spellEnd"/>
       <w:r>
         <w:rPr>
           <w:rFonts w:asciiTheme="majorHAnsi" w:hAnsiTheme="majorHAnsi" w:cstheme="majorHAnsi"/>
@@ -1235,21 +1073,7 @@
         <w:rPr>
           <w:rFonts w:asciiTheme="majorHAnsi" w:hAnsiTheme="majorHAnsi" w:cstheme="majorHAnsi"/>
         </w:rPr>
-        <w:t>Note: SFML installation steps vary by operating system. Refer to the official SFML documentation for platform-specific instructions. Ensure that both the development files (</w:t>
-      </w:r>
-      <w:proofErr w:type="gramStart"/>
-      <w:r>
-        <w:rPr>
-          <w:rFonts w:asciiTheme="majorHAnsi" w:hAnsiTheme="majorHAnsi" w:cstheme="majorHAnsi"/>
-        </w:rPr>
-        <w:t>include</w:t>
-      </w:r>
-      <w:proofErr w:type="gramEnd"/>
-      <w:r>
-        <w:rPr>
-          <w:rFonts w:asciiTheme="majorHAnsi" w:hAnsiTheme="majorHAnsi" w:cstheme="majorHAnsi"/>
-        </w:rPr>
-        <w:t>/lib) and runtime libraries are properly installed.</w:t>
+        <w:t>Note: SFML installation steps vary by operating system. Refer to the official SFML documentation for platform-specific instructions. Ensure that both the development files (include/lib) and runtime libraries are properly installed.</w:t>
       </w:r>
     </w:p>
     <w:p>
@@ -1350,18 +1174,8 @@
                 <w:color w:val="FFFFAA"/>
                 <w:shd w:val="clear" w:color="auto" w:fill="333333"/>
               </w:rPr>
-              <w:t>&lt;repository-</w:t>
+              <w:t>&lt;repository-url</w:t>
             </w:r>
-            <w:proofErr w:type="spellStart"/>
-            <w:r>
-              <w:rPr>
-                <w:rFonts w:asciiTheme="majorHAnsi" w:eastAsia="Consolas" w:hAnsiTheme="majorHAnsi" w:cstheme="majorHAnsi"/>
-                <w:color w:val="FFFFAA"/>
-                <w:shd w:val="clear" w:color="auto" w:fill="333333"/>
-              </w:rPr>
-              <w:t>url</w:t>
-            </w:r>
-            <w:proofErr w:type="spellEnd"/>
             <w:r>
               <w:rPr>
                 <w:rFonts w:asciiTheme="majorHAnsi" w:eastAsia="Consolas" w:hAnsiTheme="majorHAnsi" w:cstheme="majorHAnsi"/>
@@ -1377,18 +1191,8 @@
                 <w:shd w:val="clear" w:color="auto" w:fill="333333"/>
               </w:rPr>
               <w:br/>
-              <w:t xml:space="preserve">cd </w:t>
+              <w:t>cd BreakoutGame</w:t>
             </w:r>
-            <w:proofErr w:type="spellStart"/>
-            <w:r>
-              <w:rPr>
-                <w:rFonts w:asciiTheme="majorHAnsi" w:eastAsia="Consolas" w:hAnsiTheme="majorHAnsi" w:cstheme="majorHAnsi"/>
-                <w:color w:val="FFFFFF"/>
-                <w:shd w:val="clear" w:color="auto" w:fill="333333"/>
-              </w:rPr>
-              <w:t>BreakoutGame</w:t>
-            </w:r>
-            <w:proofErr w:type="spellEnd"/>
           </w:p>
         </w:tc>
       </w:tr>
@@ -1551,17 +1355,7 @@
                 <w:color w:val="ADE5FC"/>
                 <w:shd w:val="clear" w:color="auto" w:fill="333333"/>
               </w:rPr>
-              <w:t>$</w:t>
-            </w:r>
-            <w:proofErr w:type="spellStart"/>
-            <w:proofErr w:type="gramStart"/>
-            <w:r>
-              <w:rPr>
-                <w:rFonts w:asciiTheme="majorHAnsi" w:eastAsia="Consolas" w:hAnsiTheme="majorHAnsi" w:cstheme="majorHAnsi"/>
-                <w:color w:val="ADE5FC"/>
-                <w:shd w:val="clear" w:color="auto" w:fill="333333"/>
-              </w:rPr>
-              <w:t>env</w:t>
+              <w:t>$env</w:t>
             </w:r>
             <w:r>
               <w:rPr>
@@ -1569,25 +1363,7 @@
                 <w:color w:val="D36363"/>
                 <w:shd w:val="clear" w:color="auto" w:fill="333333"/>
               </w:rPr>
-              <w:t>:BREAKOUT</w:t>
-            </w:r>
-            <w:proofErr w:type="gramEnd"/>
-            <w:r>
-              <w:rPr>
-                <w:rFonts w:asciiTheme="majorHAnsi" w:eastAsia="Consolas" w:hAnsiTheme="majorHAnsi" w:cstheme="majorHAnsi"/>
-                <w:color w:val="D36363"/>
-                <w:shd w:val="clear" w:color="auto" w:fill="333333"/>
-              </w:rPr>
-              <w:t>_SFML_ROOT</w:t>
-            </w:r>
-            <w:proofErr w:type="spellEnd"/>
-            <w:r>
-              <w:rPr>
-                <w:rFonts w:asciiTheme="majorHAnsi" w:eastAsia="Consolas" w:hAnsiTheme="majorHAnsi" w:cstheme="majorHAnsi"/>
-                <w:color w:val="D36363"/>
-                <w:shd w:val="clear" w:color="auto" w:fill="333333"/>
-              </w:rPr>
-              <w:t>=</w:t>
+              <w:t>:BREAKOUT_SFML_ROOT=</w:t>
             </w:r>
             <w:r>
               <w:rPr>
@@ -1612,21 +1388,7 @@
         <w:rPr>
           <w:rFonts w:asciiTheme="majorHAnsi" w:hAnsiTheme="majorHAnsi" w:cstheme="majorHAnsi"/>
         </w:rPr>
-        <w:t>Linux/macOS (bash/</w:t>
-      </w:r>
-      <w:proofErr w:type="spellStart"/>
-      <w:r>
-        <w:rPr>
-          <w:rFonts w:asciiTheme="majorHAnsi" w:hAnsiTheme="majorHAnsi" w:cstheme="majorHAnsi"/>
-        </w:rPr>
-        <w:t>zsh</w:t>
-      </w:r>
-      <w:proofErr w:type="spellEnd"/>
-      <w:r>
-        <w:rPr>
-          <w:rFonts w:asciiTheme="majorHAnsi" w:hAnsiTheme="majorHAnsi" w:cstheme="majorHAnsi"/>
-        </w:rPr>
-        <w:t>):</w:t>
+        <w:t>Linux/macOS (bash/zsh):</w:t>
       </w:r>
     </w:p>
     <w:tbl>
@@ -1771,23 +1533,13 @@
                 <w:rFonts w:asciiTheme="majorHAnsi" w:hAnsiTheme="majorHAnsi" w:cstheme="majorHAnsi"/>
               </w:rPr>
             </w:pPr>
-            <w:proofErr w:type="spellStart"/>
             <w:r>
               <w:rPr>
                 <w:rFonts w:asciiTheme="majorHAnsi" w:eastAsia="Consolas" w:hAnsiTheme="majorHAnsi" w:cstheme="majorHAnsi"/>
                 <w:color w:val="FFFFFF"/>
                 <w:shd w:val="clear" w:color="auto" w:fill="333333"/>
               </w:rPr>
-              <w:t>cmake</w:t>
-            </w:r>
-            <w:proofErr w:type="spellEnd"/>
-            <w:r>
-              <w:rPr>
-                <w:rFonts w:asciiTheme="majorHAnsi" w:eastAsia="Consolas" w:hAnsiTheme="majorHAnsi" w:cstheme="majorHAnsi"/>
-                <w:color w:val="FFFFFF"/>
-                <w:shd w:val="clear" w:color="auto" w:fill="333333"/>
-              </w:rPr>
-              <w:t xml:space="preserve"> --preset default-debug</w:t>
+              <w:t>cmake --preset default-debug</w:t>
             </w:r>
             <w:r>
               <w:rPr>
@@ -1796,24 +1548,7 @@
                 <w:shd w:val="clear" w:color="auto" w:fill="333333"/>
               </w:rPr>
               <w:br/>
-            </w:r>
-            <w:proofErr w:type="spellStart"/>
-            <w:r>
-              <w:rPr>
-                <w:rFonts w:asciiTheme="majorHAnsi" w:eastAsia="Consolas" w:hAnsiTheme="majorHAnsi" w:cstheme="majorHAnsi"/>
-                <w:color w:val="FFFFFF"/>
-                <w:shd w:val="clear" w:color="auto" w:fill="333333"/>
-              </w:rPr>
-              <w:t>cmake</w:t>
-            </w:r>
-            <w:proofErr w:type="spellEnd"/>
-            <w:r>
-              <w:rPr>
-                <w:rFonts w:asciiTheme="majorHAnsi" w:eastAsia="Consolas" w:hAnsiTheme="majorHAnsi" w:cstheme="majorHAnsi"/>
-                <w:color w:val="FFFFFF"/>
-                <w:shd w:val="clear" w:color="auto" w:fill="333333"/>
-              </w:rPr>
-              <w:t xml:space="preserve"> --</w:t>
+              <w:t>cmake --</w:t>
             </w:r>
             <w:r>
               <w:rPr>
@@ -1889,7 +1624,6 @@
                 <w:rFonts w:asciiTheme="majorHAnsi" w:hAnsiTheme="majorHAnsi" w:cstheme="majorHAnsi"/>
               </w:rPr>
             </w:pPr>
-            <w:proofErr w:type="spellStart"/>
             <w:r>
               <w:rPr>
                 <w:rFonts w:asciiTheme="majorHAnsi" w:eastAsia="Consolas" w:hAnsiTheme="majorHAnsi" w:cstheme="majorHAnsi"/>
@@ -1898,32 +1632,13 @@
               </w:rPr>
               <w:t>cmake</w:t>
             </w:r>
-            <w:proofErr w:type="spellEnd"/>
             <w:r>
               <w:rPr>
                 <w:rFonts w:asciiTheme="majorHAnsi" w:eastAsia="Consolas" w:hAnsiTheme="majorHAnsi" w:cstheme="majorHAnsi"/>
                 <w:color w:val="FFFFFF"/>
                 <w:shd w:val="clear" w:color="auto" w:fill="333333"/>
               </w:rPr>
-              <w:t xml:space="preserve"> -</w:t>
-            </w:r>
-            <w:proofErr w:type="gramStart"/>
-            <w:r>
-              <w:rPr>
-                <w:rFonts w:asciiTheme="majorHAnsi" w:eastAsia="Consolas" w:hAnsiTheme="majorHAnsi" w:cstheme="majorHAnsi"/>
-                <w:color w:val="FFFFFF"/>
-                <w:shd w:val="clear" w:color="auto" w:fill="333333"/>
-              </w:rPr>
-              <w:t>S .</w:t>
-            </w:r>
-            <w:proofErr w:type="gramEnd"/>
-            <w:r>
-              <w:rPr>
-                <w:rFonts w:asciiTheme="majorHAnsi" w:eastAsia="Consolas" w:hAnsiTheme="majorHAnsi" w:cstheme="majorHAnsi"/>
-                <w:color w:val="FFFFFF"/>
-                <w:shd w:val="clear" w:color="auto" w:fill="333333"/>
-              </w:rPr>
-              <w:t xml:space="preserve"> -</w:t>
+              <w:t xml:space="preserve"> -S . -</w:t>
             </w:r>
             <w:r>
               <w:rPr>
@@ -1941,7 +1656,6 @@
               </w:rPr>
               <w:br/>
             </w:r>
-            <w:proofErr w:type="spellStart"/>
             <w:r>
               <w:rPr>
                 <w:rFonts w:asciiTheme="majorHAnsi" w:eastAsia="Consolas" w:hAnsiTheme="majorHAnsi" w:cstheme="majorHAnsi"/>
@@ -1951,7 +1665,6 @@
               <w:lastRenderedPageBreak/>
               <w:t>cmake</w:t>
             </w:r>
-            <w:proofErr w:type="spellEnd"/>
             <w:r>
               <w:rPr>
                 <w:rFonts w:asciiTheme="majorHAnsi" w:eastAsia="Consolas" w:hAnsiTheme="majorHAnsi" w:cstheme="majorHAnsi"/>
@@ -1966,18 +1679,8 @@
                 <w:color w:val="FCC28C"/>
                 <w:shd w:val="clear" w:color="auto" w:fill="333333"/>
               </w:rPr>
-              <w:t xml:space="preserve">build </w:t>
+              <w:t>build build</w:t>
             </w:r>
-            <w:proofErr w:type="spellStart"/>
-            <w:r>
-              <w:rPr>
-                <w:rFonts w:asciiTheme="majorHAnsi" w:eastAsia="Consolas" w:hAnsiTheme="majorHAnsi" w:cstheme="majorHAnsi"/>
-                <w:color w:val="FCC28C"/>
-                <w:shd w:val="clear" w:color="auto" w:fill="333333"/>
-              </w:rPr>
-              <w:t>build</w:t>
-            </w:r>
-            <w:proofErr w:type="spellEnd"/>
           </w:p>
         </w:tc>
       </w:tr>
@@ -2080,21 +1783,7 @@
         <w:rPr>
           <w:rFonts w:asciiTheme="majorHAnsi" w:hAnsiTheme="majorHAnsi" w:cstheme="majorHAnsi"/>
         </w:rPr>
-        <w:t xml:space="preserve">For the </w:t>
-      </w:r>
-      <w:proofErr w:type="spellStart"/>
-      <w:r>
-        <w:rPr>
-          <w:rFonts w:asciiTheme="majorHAnsi" w:hAnsiTheme="majorHAnsi" w:cstheme="majorHAnsi"/>
-        </w:rPr>
-        <w:t>CMake</w:t>
-      </w:r>
-      <w:proofErr w:type="spellEnd"/>
-      <w:r>
-        <w:rPr>
-          <w:rFonts w:asciiTheme="majorHAnsi" w:hAnsiTheme="majorHAnsi" w:cstheme="majorHAnsi"/>
-        </w:rPr>
-        <w:t xml:space="preserve"> workflow, use:</w:t>
+        <w:t>For the CMake workflow, use:</w:t>
       </w:r>
     </w:p>
     <w:p>
@@ -2104,19 +1793,11 @@
           <w:rFonts w:asciiTheme="majorHAnsi" w:hAnsiTheme="majorHAnsi" w:cstheme="majorHAnsi"/>
         </w:rPr>
       </w:pPr>
-      <w:proofErr w:type="spellStart"/>
-      <w:r>
-        <w:rPr>
-          <w:rFonts w:asciiTheme="majorHAnsi" w:hAnsiTheme="majorHAnsi" w:cstheme="majorHAnsi"/>
-        </w:rPr>
-        <w:t>cmake</w:t>
-      </w:r>
-      <w:proofErr w:type="spellEnd"/>
-      <w:r>
-        <w:rPr>
-          <w:rFonts w:asciiTheme="majorHAnsi" w:hAnsiTheme="majorHAnsi" w:cstheme="majorHAnsi"/>
-        </w:rPr>
-        <w:t xml:space="preserve"> --preset default-debug</w:t>
+      <w:r>
+        <w:rPr>
+          <w:rFonts w:asciiTheme="majorHAnsi" w:hAnsiTheme="majorHAnsi" w:cstheme="majorHAnsi"/>
+        </w:rPr>
+        <w:t>cmake --preset default-debug</w:t>
       </w:r>
     </w:p>
     <w:p>
@@ -2126,46 +1807,24 @@
           <w:rFonts w:asciiTheme="majorHAnsi" w:hAnsiTheme="majorHAnsi" w:cstheme="majorHAnsi"/>
         </w:rPr>
       </w:pPr>
-      <w:proofErr w:type="spellStart"/>
-      <w:r>
-        <w:rPr>
-          <w:rFonts w:asciiTheme="majorHAnsi" w:hAnsiTheme="majorHAnsi" w:cstheme="majorHAnsi"/>
-        </w:rPr>
-        <w:t>cmake</w:t>
-      </w:r>
-      <w:proofErr w:type="spellEnd"/>
-      <w:r>
-        <w:rPr>
-          <w:rFonts w:asciiTheme="majorHAnsi" w:hAnsiTheme="majorHAnsi" w:cstheme="majorHAnsi"/>
-        </w:rPr>
-        <w:t xml:space="preserve"> --build --preset default-debug</w:t>
-      </w:r>
-    </w:p>
-    <w:p>
-      <w:pPr>
-        <w:rPr>
-          <w:rFonts w:asciiTheme="majorHAnsi" w:hAnsiTheme="majorHAnsi" w:cstheme="majorHAnsi"/>
-        </w:rPr>
-      </w:pPr>
-      <w:r>
-        <w:rPr>
-          <w:rFonts w:asciiTheme="majorHAnsi" w:hAnsiTheme="majorHAnsi" w:cstheme="majorHAnsi"/>
-        </w:rPr>
-        <w:t xml:space="preserve">The </w:t>
-      </w:r>
-      <w:proofErr w:type="spellStart"/>
-      <w:r>
-        <w:rPr>
-          <w:rFonts w:asciiTheme="majorHAnsi" w:hAnsiTheme="majorHAnsi" w:cstheme="majorHAnsi"/>
-        </w:rPr>
-        <w:t>CMake</w:t>
-      </w:r>
-      <w:proofErr w:type="spellEnd"/>
-      <w:r>
-        <w:rPr>
-          <w:rFonts w:asciiTheme="majorHAnsi" w:hAnsiTheme="majorHAnsi" w:cstheme="majorHAnsi"/>
-        </w:rPr>
-        <w:t xml:space="preserve"> build output is named main or main.exe depending on platform and build directory. If the executable fails to start because SFML or other runtime libraries are missing, verify that the required DLL/shared-library paths are available.</w:t>
+      <w:r>
+        <w:rPr>
+          <w:rFonts w:asciiTheme="majorHAnsi" w:hAnsiTheme="majorHAnsi" w:cstheme="majorHAnsi"/>
+        </w:rPr>
+        <w:t>cmake --build --preset default-debug</w:t>
+      </w:r>
+    </w:p>
+    <w:p>
+      <w:pPr>
+        <w:rPr>
+          <w:rFonts w:asciiTheme="majorHAnsi" w:hAnsiTheme="majorHAnsi" w:cstheme="majorHAnsi"/>
+        </w:rPr>
+      </w:pPr>
+      <w:r>
+        <w:rPr>
+          <w:rFonts w:asciiTheme="majorHAnsi" w:hAnsiTheme="majorHAnsi" w:cstheme="majorHAnsi"/>
+        </w:rPr>
+        <w:t>The CMake build output is named main or main.exe depending on platform and build directory. If the executable fails to start because SFML or other runtime libraries are missing, verify that the required DLL/shared-library paths are available.</w:t>
       </w:r>
     </w:p>
     <w:p>
@@ -3732,21 +3391,7 @@
         <w:rPr>
           <w:rFonts w:asciiTheme="majorHAnsi" w:hAnsiTheme="majorHAnsi" w:cstheme="majorHAnsi"/>
         </w:rPr>
-        <w:t xml:space="preserve">Win </w:t>
-      </w:r>
-      <w:proofErr w:type="gramStart"/>
-      <w:r>
-        <w:rPr>
-          <w:rFonts w:asciiTheme="majorHAnsi" w:hAnsiTheme="majorHAnsi" w:cstheme="majorHAnsi"/>
-        </w:rPr>
-        <w:t>condition</w:t>
-      </w:r>
-      <w:proofErr w:type="gramEnd"/>
-      <w:r>
-        <w:rPr>
-          <w:rFonts w:asciiTheme="majorHAnsi" w:hAnsiTheme="majorHAnsi" w:cstheme="majorHAnsi"/>
-        </w:rPr>
-        <w:t xml:space="preserve"> when all bricks are destroyed</w:t>
+        <w:t>Win condition when all bricks are destroyed</w:t>
       </w:r>
     </w:p>
     <w:p>
@@ -3836,16 +3481,8 @@
         <w:rPr>
           <w:rFonts w:asciiTheme="majorHAnsi" w:hAnsiTheme="majorHAnsi" w:cstheme="majorHAnsi"/>
         </w:rPr>
-        <w:t xml:space="preserve">SQLite-backed high-score database using </w:t>
-      </w:r>
-      <w:proofErr w:type="spellStart"/>
-      <w:r>
-        <w:rPr>
-          <w:rFonts w:asciiTheme="majorHAnsi" w:hAnsiTheme="majorHAnsi" w:cstheme="majorHAnsi"/>
-        </w:rPr>
-        <w:t>BreakOutScores.db</w:t>
-      </w:r>
-      <w:proofErr w:type="spellEnd"/>
+        <w:t>SQLite-backed high-score database using BreakOutScores.db</w:t>
+      </w:r>
     </w:p>
     <w:p>
       <w:pPr>
@@ -3862,21 +3499,7 @@
         <w:rPr>
           <w:rFonts w:asciiTheme="majorHAnsi" w:hAnsiTheme="majorHAnsi" w:cstheme="majorHAnsi"/>
         </w:rPr>
-        <w:t xml:space="preserve">High </w:t>
-      </w:r>
-      <w:proofErr w:type="gramStart"/>
-      <w:r>
-        <w:rPr>
-          <w:rFonts w:asciiTheme="majorHAnsi" w:hAnsiTheme="majorHAnsi" w:cstheme="majorHAnsi"/>
-        </w:rPr>
-        <w:t>score</w:t>
-      </w:r>
-      <w:proofErr w:type="gramEnd"/>
-      <w:r>
-        <w:rPr>
-          <w:rFonts w:asciiTheme="majorHAnsi" w:hAnsiTheme="majorHAnsi" w:cstheme="majorHAnsi"/>
-        </w:rPr>
-        <w:t xml:space="preserve"> update only when the player wins with a score higher than the stored score</w:t>
+        <w:t>High score update only when the player wins with a score higher than the stored score</w:t>
       </w:r>
     </w:p>
     <w:p>
@@ -4069,49 +3692,7 @@
         <w:rPr>
           <w:rFonts w:asciiTheme="majorHAnsi" w:hAnsiTheme="majorHAnsi" w:cstheme="majorHAnsi"/>
         </w:rPr>
-        <w:t xml:space="preserve">The game stores </w:t>
-      </w:r>
-      <w:proofErr w:type="gramStart"/>
-      <w:r>
-        <w:rPr>
-          <w:rFonts w:asciiTheme="majorHAnsi" w:hAnsiTheme="majorHAnsi" w:cstheme="majorHAnsi"/>
-        </w:rPr>
-        <w:t>the high score</w:t>
-      </w:r>
-      <w:proofErr w:type="gramEnd"/>
-      <w:r>
-        <w:rPr>
-          <w:rFonts w:asciiTheme="majorHAnsi" w:hAnsiTheme="majorHAnsi" w:cstheme="majorHAnsi"/>
-        </w:rPr>
-        <w:t xml:space="preserve"> in a local SQLite database file named </w:t>
-      </w:r>
-      <w:proofErr w:type="spellStart"/>
-      <w:r>
-        <w:rPr>
-          <w:rFonts w:asciiTheme="majorHAnsi" w:hAnsiTheme="majorHAnsi" w:cstheme="majorHAnsi"/>
-        </w:rPr>
-        <w:t>BreakOutScores.db</w:t>
-      </w:r>
-      <w:proofErr w:type="spellEnd"/>
-      <w:r>
-        <w:rPr>
-          <w:rFonts w:asciiTheme="majorHAnsi" w:hAnsiTheme="majorHAnsi" w:cstheme="majorHAnsi"/>
-        </w:rPr>
-        <w:t xml:space="preserve">. The database contains a scores table with the saved score for level 1. The high score is updated only when the player </w:t>
-      </w:r>
-      <w:proofErr w:type="gramStart"/>
-      <w:r>
-        <w:rPr>
-          <w:rFonts w:asciiTheme="majorHAnsi" w:hAnsiTheme="majorHAnsi" w:cstheme="majorHAnsi"/>
-        </w:rPr>
-        <w:t>wins</w:t>
-      </w:r>
-      <w:proofErr w:type="gramEnd"/>
-      <w:r>
-        <w:rPr>
-          <w:rFonts w:asciiTheme="majorHAnsi" w:hAnsiTheme="majorHAnsi" w:cstheme="majorHAnsi"/>
-        </w:rPr>
-        <w:t xml:space="preserve"> and the final score is higher than the previously stored score.</w:t>
+        <w:t>The game stores the high score in a local SQLite database file named BreakOutScores.db. The database contains a scores table with the saved score for level 1. The high score is updated only when the player wins and the final score is higher than the previously stored score.</w:t>
       </w:r>
     </w:p>
     <w:p>
@@ -4235,35 +3816,7 @@
         <w:rPr>
           <w:rFonts w:asciiTheme="majorHAnsi" w:hAnsiTheme="majorHAnsi" w:cstheme="majorHAnsi"/>
         </w:rPr>
-        <w:t>Brick</w:t>
-      </w:r>
-      <w:proofErr w:type="gramStart"/>
-      <w:r>
-        <w:rPr>
-          <w:rFonts w:asciiTheme="majorHAnsi" w:hAnsiTheme="majorHAnsi" w:cstheme="majorHAnsi"/>
-        </w:rPr>
-        <w:t>-destruction sound</w:t>
-      </w:r>
-      <w:proofErr w:type="gramEnd"/>
-      <w:r>
-        <w:rPr>
-          <w:rFonts w:asciiTheme="majorHAnsi" w:hAnsiTheme="majorHAnsi" w:cstheme="majorHAnsi"/>
-        </w:rPr>
-        <w:t xml:space="preserve"> plays when </w:t>
-      </w:r>
-      <w:proofErr w:type="gramStart"/>
-      <w:r>
-        <w:rPr>
-          <w:rFonts w:asciiTheme="majorHAnsi" w:hAnsiTheme="majorHAnsi" w:cstheme="majorHAnsi"/>
-        </w:rPr>
-        <w:t>a brick</w:t>
-      </w:r>
-      <w:proofErr w:type="gramEnd"/>
-      <w:r>
-        <w:rPr>
-          <w:rFonts w:asciiTheme="majorHAnsi" w:hAnsiTheme="majorHAnsi" w:cstheme="majorHAnsi"/>
-        </w:rPr>
-        <w:t xml:space="preserve"> is broken.</w:t>
+        <w:t>Brick-destruction sound plays when a brick is broken.</w:t>
       </w:r>
     </w:p>
     <w:p>
@@ -4462,21 +4015,7 @@
         <w:rPr>
           <w:rFonts w:asciiTheme="majorHAnsi" w:hAnsiTheme="majorHAnsi" w:cstheme="majorHAnsi"/>
         </w:rPr>
-        <w:t xml:space="preserve">No text appears </w:t>
-      </w:r>
-      <w:proofErr w:type="gramStart"/>
-      <w:r>
-        <w:rPr>
-          <w:rFonts w:asciiTheme="majorHAnsi" w:hAnsiTheme="majorHAnsi" w:cstheme="majorHAnsi"/>
-        </w:rPr>
-        <w:t>in</w:t>
-      </w:r>
-      <w:proofErr w:type="gramEnd"/>
-      <w:r>
-        <w:rPr>
-          <w:rFonts w:asciiTheme="majorHAnsi" w:hAnsiTheme="majorHAnsi" w:cstheme="majorHAnsi"/>
-        </w:rPr>
-        <w:t xml:space="preserve"> menus or HUD</w:t>
+        <w:t>No text appears in menus or HUD</w:t>
       </w:r>
     </w:p>
     <w:p>
@@ -4615,24 +4154,6 @@
           <w:rFonts w:asciiTheme="majorHAnsi" w:hAnsiTheme="majorHAnsi" w:cstheme="majorHAnsi"/>
         </w:rPr>
         <w:t>The game currently includes a single level with no level progression system.</w:t>
-      </w:r>
-    </w:p>
-    <w:p>
-      <w:pPr>
-        <w:pStyle w:val="ListParagraph"/>
-        <w:numPr>
-          <w:ilvl w:val="0"/>
-          <w:numId w:val="13"/>
-        </w:numPr>
-        <w:rPr>
-          <w:rFonts w:asciiTheme="majorHAnsi" w:hAnsiTheme="majorHAnsi" w:cstheme="majorHAnsi"/>
-        </w:rPr>
-      </w:pPr>
-      <w:r>
-        <w:rPr>
-          <w:rFonts w:asciiTheme="majorHAnsi" w:hAnsiTheme="majorHAnsi" w:cstheme="majorHAnsi"/>
-        </w:rPr>
-        <w:t>A ball-bounce sound effect is not currently assigned, although background music, button click sound, and brick-destruction sound are implemented.</w:t>
       </w:r>
     </w:p>
     <w:p>

</xml_diff>